<commit_message>
auto(daily): dev loop report 2026-06-03
</commit_message>
<xml_diff>
--- a/reports/hypothesis/2026-06-03.docx
+++ b/reports/hypothesis/2026-06-03.docx
@@ -15,7 +15,7 @@
         <w:rPr>
           <w:i/>
         </w:rPr>
-        <w:t>생성일: 2026-06-03 09:15 KST  |  표본: 측정소당 최소 2221건 / 총 11280건</w:t>
+        <w:t>생성일: 2026-06-03 14:14 KST  |  표본: 측정소당 최소 2225건 / 총 11300건</w:t>
       </w:r>
     </w:p>
     <w:p>
@@ -143,7 +143,7 @@
           </w:tcPr>
           <w:p>
             <w:r>
-              <w:t>38.108</w:t>
+              <w:t>38.125</w:t>
             </w:r>
           </w:p>
         </w:tc>
@@ -153,7 +153,7 @@
           </w:tcPr>
           <w:p>
             <w:r>
-              <w:t>34.021</w:t>
+              <w:t>34.032</w:t>
             </w:r>
           </w:p>
         </w:tc>
@@ -163,7 +163,7 @@
           </w:tcPr>
           <w:p>
             <w:r>
-              <w:t>+4.087</w:t>
+              <w:t>+4.093</w:t>
             </w:r>
           </w:p>
         </w:tc>
@@ -215,7 +215,7 @@
           </w:tcPr>
           <w:p>
             <w:r>
-              <w:t>21.222</w:t>
+              <w:t>21.236</w:t>
             </w:r>
           </w:p>
         </w:tc>
@@ -225,7 +225,7 @@
           </w:tcPr>
           <w:p>
             <w:r>
-              <w:t>17.763</w:t>
+              <w:t>17.775</w:t>
             </w:r>
           </w:p>
         </w:tc>
@@ -235,7 +235,7 @@
           </w:tcPr>
           <w:p>
             <w:r>
-              <w:t>+3.458</w:t>
+              <w:t>+3.461</w:t>
             </w:r>
           </w:p>
         </w:tc>
@@ -513,7 +513,7 @@
           </w:tcPr>
           <w:p>
             <w:r>
-              <w:t>0.487</w:t>
+              <w:t>0.486</w:t>
             </w:r>
           </w:p>
         </w:tc>
@@ -660,7 +660,7 @@
           </w:tcPr>
           <w:p>
             <w:r>
-              <w:t>37.85</w:t>
+              <w:t>38.04</w:t>
             </w:r>
           </w:p>
         </w:tc>
@@ -722,7 +722,7 @@
           </w:tcPr>
           <w:p>
             <w:r>
-              <w:t>76.72</w:t>
+              <w:t>76.75</w:t>
             </w:r>
           </w:p>
         </w:tc>
@@ -784,7 +784,7 @@
           </w:tcPr>
           <w:p>
             <w:r>
-              <w:t>16.07</w:t>
+              <w:t>15.87</w:t>
             </w:r>
           </w:p>
         </w:tc>
@@ -846,7 +846,7 @@
           </w:tcPr>
           <w:p>
             <w:r>
-              <w:t>145.13</w:t>
+              <w:t>145.54</w:t>
             </w:r>
           </w:p>
         </w:tc>
@@ -908,7 +908,7 @@
           </w:tcPr>
           <w:p>
             <w:r>
-              <w:t>70.34</w:t>
+              <w:t>70.05</w:t>
             </w:r>
           </w:p>
         </w:tc>
@@ -970,7 +970,7 @@
           </w:tcPr>
           <w:p>
             <w:r>
-              <w:t>156.74</w:t>
+              <w:t>156.44</w:t>
             </w:r>
           </w:p>
         </w:tc>
@@ -1000,7 +1000,7 @@
           </w:tcPr>
           <w:p>
             <w:r>
-              <w:t>0.055</w:t>
+              <w:t>0.054</w:t>
             </w:r>
           </w:p>
         </w:tc>

</xml_diff>